<commit_message>
auto: checkpoint 2026-08-27 05:17:54
</commit_message>
<xml_diff>
--- a/clients/tb-tradez/TB-Tradez-Service-Agreement.docx
+++ b/clients/tb-tradez/TB-Tradez-Service-Agreement.docx
@@ -80,27 +80,27 @@
           <w:szCs w:val="22"/>
           <w:rtl w:val="0"/>
         </w:rPr>
-        <w:t xml:space="preserve">_______________________________, hereinafter referred to as the “Operator”; -and-</w:t>
-      </w:r>
-      <w:r>
-        <w:rPr>
-          <w:rtl w:val="0"/>
-        </w:rPr>
-      </w:r>
-    </w:p>
-    <w:p>
-      <w:pPr>
-        <w:spacing w:after="160" w:lineRule="auto"/>
-        <w:rPr/>
-      </w:pPr>
-      <w:r>
-        <w:rPr>
-          <w:rFonts w:ascii="Calibri" w:cs="Calibri" w:eastAsia="Calibri" w:hAnsi="Calibri"/>
-          <w:sz w:val="22"/>
-          <w:szCs w:val="22"/>
-          <w:rtl w:val="0"/>
-        </w:rPr>
-        <w:t xml:space="preserve">_______________________________, hereinafter referred to as the “Client.”</w:t>
+        <w:t>Abdullah Dagestani, trading as Pulsifymedia, hereinafter referred to as the “Operator”; -and-</w:t>
+      </w:r>
+      <w:r>
+        <w:rPr>
+          <w:rtl w:val="0"/>
+        </w:rPr>
+      </w:r>
+    </w:p>
+    <w:p>
+      <w:pPr>
+        <w:spacing w:after="160" w:lineRule="auto"/>
+        <w:rPr/>
+      </w:pPr>
+      <w:r>
+        <w:rPr>
+          <w:rFonts w:ascii="Calibri" w:cs="Calibri" w:eastAsia="Calibri" w:hAnsi="Calibri"/>
+          <w:sz w:val="22"/>
+          <w:szCs w:val="22"/>
+          <w:rtl w:val="0"/>
+        </w:rPr>
+        <w:t>Tahlon Buttle, hereinafter referred to as the “Client.”</w:t>
       </w:r>
       <w:r>
         <w:rPr>
@@ -2294,7 +2294,7 @@
           <w:szCs w:val="22"/>
           <w:rtl w:val="0"/>
         </w:rPr>
-        <w:t xml:space="preserve">Full legal name: _______________________________</w:t>
+        <w:t>Full legal name: Tahlon Buttle</w:t>
       </w:r>
       <w:r>
         <w:rPr>
@@ -2342,128 +2342,167 @@
         </w:rPr>
       </w:r>
     </w:p>
-    <w:p>
-      <w:pPr>
-        <w:spacing w:before="240" w:lineRule="auto"/>
-        <w:rPr/>
-      </w:pPr>
-      <w:r>
-        <w:rPr>
-          <w:rFonts w:ascii="Calibri" w:cs="Calibri" w:eastAsia="Calibri" w:hAnsi="Calibri"/>
-          <w:b w:val="1"/>
-          <w:bCs w:val="1"/>
-          <w:sz w:val="22"/>
-          <w:szCs w:val="22"/>
-          <w:rtl w:val="0"/>
-        </w:rPr>
-        <w:t xml:space="preserve">CLIENT</w:t>
-      </w:r>
-      <w:r>
-        <w:rPr>
-          <w:rFonts w:ascii="Calibri" w:cs="Calibri" w:eastAsia="Calibri" w:hAnsi="Calibri"/>
-          <w:sz w:val="22"/>
-          <w:szCs w:val="22"/>
-          <w:rtl w:val="0"/>
-        </w:rPr>
-        <w:t xml:space="preserve">                                                                 </w:t>
-      </w:r>
-      <w:r>
-        <w:rPr>
-          <w:rFonts w:ascii="Calibri" w:cs="Calibri" w:eastAsia="Calibri" w:hAnsi="Calibri"/>
-          <w:b w:val="1"/>
-          <w:bCs w:val="1"/>
-          <w:sz w:val="22"/>
-          <w:szCs w:val="22"/>
-          <w:rtl w:val="0"/>
-        </w:rPr>
-        <w:t xml:space="preserve">OPERATOR</w:t>
-      </w:r>
-      <w:r>
-        <w:rPr>
-          <w:rtl w:val="0"/>
-        </w:rPr>
-      </w:r>
-    </w:p>
-    <w:p>
-      <w:pPr>
-        <w:spacing w:after="200" w:before="160" w:lineRule="auto"/>
-        <w:rPr/>
-      </w:pPr>
-      <w:r>
-        <w:rPr>
-          <w:rFonts w:ascii="Calibri" w:cs="Calibri" w:eastAsia="Calibri" w:hAnsi="Calibri"/>
-          <w:sz w:val="22"/>
-          <w:szCs w:val="22"/>
-          <w:rtl w:val="0"/>
-        </w:rPr>
-        <w:t xml:space="preserve">Signed: _______________________________        Signed: _______________________________</w:t>
-      </w:r>
-      <w:r>
-        <w:rPr>
-          <w:rtl w:val="0"/>
-        </w:rPr>
-      </w:r>
-    </w:p>
-    <w:p>
-      <w:pPr>
-        <w:spacing w:after="200" w:lineRule="auto"/>
-        <w:rPr/>
-      </w:pPr>
-      <w:r>
-        <w:rPr>
-          <w:rFonts w:ascii="Calibri" w:cs="Calibri" w:eastAsia="Calibri" w:hAnsi="Calibri"/>
-          <w:sz w:val="22"/>
-          <w:szCs w:val="22"/>
-          <w:rtl w:val="0"/>
-        </w:rPr>
-        <w:t xml:space="preserve">Name:   _______________________________        Name:   _______________________________</w:t>
-      </w:r>
-      <w:r>
-        <w:rPr>
-          <w:rtl w:val="0"/>
-        </w:rPr>
-      </w:r>
-    </w:p>
-    <w:p>
-      <w:pPr>
-        <w:spacing w:after="200" w:lineRule="auto"/>
-        <w:rPr/>
-      </w:pPr>
-      <w:r>
-        <w:rPr>
-          <w:rFonts w:ascii="Calibri" w:cs="Calibri" w:eastAsia="Calibri" w:hAnsi="Calibri"/>
-          <w:sz w:val="22"/>
-          <w:szCs w:val="22"/>
-          <w:rtl w:val="0"/>
-        </w:rPr>
-        <w:t xml:space="preserve">Title:    _______________________________        Title:    _______________________________</w:t>
-      </w:r>
-      <w:r>
-        <w:rPr>
-          <w:rtl w:val="0"/>
-        </w:rPr>
-      </w:r>
-    </w:p>
-    <w:p>
-      <w:pPr>
-        <w:spacing w:after="200" w:lineRule="auto"/>
-        <w:rPr/>
-      </w:pPr>
-      <w:r>
-        <w:rPr>
-          <w:rFonts w:ascii="Calibri" w:cs="Calibri" w:eastAsia="Calibri" w:hAnsi="Calibri"/>
-          <w:sz w:val="22"/>
-          <w:szCs w:val="22"/>
-          <w:rtl w:val="0"/>
-        </w:rPr>
-        <w:t xml:space="preserve">Date:    _______________________________        Date:    _______________________________</w:t>
-      </w:r>
-      <w:r>
-        <w:rPr>
-          <w:rtl w:val="0"/>
-        </w:rPr>
-      </w:r>
-    </w:p>
+    <w:tbl>
+      <w:tblPr>
+        <w:tblW w:type="auto" w:w="0"/>
+        <w:tblLayout w:type="autofit"/>
+        <w:tblLook w:firstColumn="1" w:firstRow="1" w:lastColumn="0" w:lastRow="0" w:noHBand="0" w:noVBand="1" w:val="04A0"/>
+      </w:tblPr>
+      <w:tblGrid>
+        <w:gridCol w:w="4680"/>
+        <w:gridCol w:w="4680"/>
+      </w:tblGrid>
+      <w:tr>
+        <w:tc>
+          <w:tcPr>
+            <w:tcW w:type="dxa" w:w="4680"/>
+          </w:tcPr>
+          <w:p>
+            <w:r>
+              <w:rPr>
+                <w:b/>
+                <w:sz w:val="22"/>
+              </w:rPr>
+              <w:t>CLIENT</w:t>
+            </w:r>
+          </w:p>
+        </w:tc>
+        <w:tc>
+          <w:tcPr>
+            <w:tcW w:type="dxa" w:w="4680"/>
+          </w:tcPr>
+          <w:p>
+            <w:r>
+              <w:rPr>
+                <w:b/>
+                <w:sz w:val="22"/>
+              </w:rPr>
+              <w:t>OPERATOR</w:t>
+            </w:r>
+          </w:p>
+        </w:tc>
+      </w:tr>
+      <w:tr>
+        <w:tc>
+          <w:tcPr>
+            <w:tcW w:type="dxa" w:w="4680"/>
+          </w:tcPr>
+          <w:p>
+            <w:r>
+              <w:rPr>
+                <w:b w:val="0"/>
+                <w:sz w:val="22"/>
+              </w:rPr>
+              <w:t>Signed: _______________________________</w:t>
+            </w:r>
+          </w:p>
+        </w:tc>
+        <w:tc>
+          <w:tcPr>
+            <w:tcW w:type="dxa" w:w="4680"/>
+          </w:tcPr>
+          <w:p>
+            <w:r>
+              <w:rPr>
+                <w:b w:val="0"/>
+                <w:sz w:val="22"/>
+              </w:rPr>
+              <w:t>Signed: _______________________________</w:t>
+            </w:r>
+          </w:p>
+        </w:tc>
+      </w:tr>
+      <w:tr>
+        <w:tc>
+          <w:tcPr>
+            <w:tcW w:type="dxa" w:w="4680"/>
+          </w:tcPr>
+          <w:p>
+            <w:r>
+              <w:rPr>
+                <w:b w:val="0"/>
+                <w:sz w:val="22"/>
+              </w:rPr>
+              <w:t>Name: Tahlon Buttle</w:t>
+            </w:r>
+          </w:p>
+        </w:tc>
+        <w:tc>
+          <w:tcPr>
+            <w:tcW w:type="dxa" w:w="4680"/>
+          </w:tcPr>
+          <w:p>
+            <w:r>
+              <w:rPr>
+                <w:b w:val="0"/>
+                <w:sz w:val="22"/>
+              </w:rPr>
+              <w:t>Name: Abdullah Dagestani</w:t>
+            </w:r>
+          </w:p>
+        </w:tc>
+      </w:tr>
+      <w:tr>
+        <w:tc>
+          <w:tcPr>
+            <w:tcW w:type="dxa" w:w="4680"/>
+          </w:tcPr>
+          <w:p>
+            <w:r>
+              <w:rPr>
+                <w:b w:val="0"/>
+                <w:sz w:val="22"/>
+              </w:rPr>
+              <w:t>Title: _______________________________</w:t>
+            </w:r>
+          </w:p>
+        </w:tc>
+        <w:tc>
+          <w:tcPr>
+            <w:tcW w:type="dxa" w:w="4680"/>
+          </w:tcPr>
+          <w:p>
+            <w:r>
+              <w:rPr>
+                <w:b w:val="0"/>
+                <w:sz w:val="22"/>
+              </w:rPr>
+              <w:t>Title: Founder</w:t>
+            </w:r>
+          </w:p>
+        </w:tc>
+      </w:tr>
+      <w:tr>
+        <w:tc>
+          <w:tcPr>
+            <w:tcW w:type="dxa" w:w="4680"/>
+          </w:tcPr>
+          <w:p>
+            <w:r>
+              <w:rPr>
+                <w:b w:val="0"/>
+                <w:sz w:val="22"/>
+              </w:rPr>
+              <w:t>Date: _______________________________</w:t>
+            </w:r>
+          </w:p>
+        </w:tc>
+        <w:tc>
+          <w:tcPr>
+            <w:tcW w:type="dxa" w:w="4680"/>
+          </w:tcPr>
+          <w:p>
+            <w:r>
+              <w:rPr>
+                <w:b w:val="0"/>
+                <w:sz w:val="22"/>
+              </w:rPr>
+              <w:t>Date: _______________________________</w:t>
+            </w:r>
+          </w:p>
+        </w:tc>
+      </w:tr>
+    </w:tbl>
     <w:sectPr>
       <w:pgSz w:h="15840" w:w="12240" w:orient="portrait"/>
       <w:pgMar w:bottom="1440" w:top="1440" w:left="1440" w:right="1440" w:header="708" w:footer="708"/>

</xml_diff>

<commit_message>
auto: checkpoint 2026-08-27 05:39:50
</commit_message>
<xml_diff>
--- a/clients/tb-tradez/TB-Tradez-Service-Agreement.docx
+++ b/clients/tb-tradez/TB-Tradez-Service-Agreement.docx
@@ -80,7 +80,7 @@
           <w:szCs w:val="22"/>
           <w:rtl w:val="0"/>
         </w:rPr>
-        <w:t>Abdullah Dagestani, trading as Pulsifymedia, hereinafter referred to as the “Operator”; -and-</w:t>
+        <w:t>Pulsifymedia, hereinafter referred to as the “Operator”; -and-</w:t>
       </w:r>
       <w:r>
         <w:rPr>
@@ -2437,7 +2437,7 @@
                 <w:b w:val="0"/>
                 <w:sz w:val="22"/>
               </w:rPr>
-              <w:t>Name: Abdullah Dagestani</w:t>
+              <w:t>Name: _______________________________</w:t>
             </w:r>
           </w:p>
         </w:tc>

</xml_diff>